<commit_message>
Clarify lab 2 bug wording and repeat full environment per report
</commit_message>
<xml_diff>
--- a/Готовые работы/Лабораторная 2 — Командный отчёт.docx
+++ b/Готовые работы/Лабораторная 2 — Командный отчёт.docx
@@ -139,7 +139,13 @@
     </w:p>
     <w:p>
       <w:r>
-        <w:t>Окружение: Windows 11 Pro, версия 10.0.22631, сборка 22631; Chromium 139.0.7258.5, режим headless, Playwright 1.51.1. Область страницы 1366 × 900 CSS px, кроме BUG-004: 375 × 812. Масштаб 100%, коэффициент пикселей 1, язык браузера en-US, часовой пояс Europe/Moscow. Использован настольный компьютер; физические мобильные устройства не проверялись.</w:t>
+        <w:rPr>
+          <w:b/>
+        </w:rPr>
+        <w:t>Окружение:</w:t>
+      </w:r>
+      <w:r>
+        <w:t xml:space="preserve"> Windows 11 Pro, версия 10.0.22631, сборка 22631; настольный компьютер; Chromium 139.0.7258.5, headless; Playwright 1.51.1; размер видимой области браузера 1366 × 900 CSS px; масштаб 100%, коэффициент пикселей 1; язык en-US; часовой пояс Europe/Moscow. Для BUG-004 размер видимой области браузера — 375 × 812 CSS px. Физические мобильные устройства не проверялись.</w:t>
       </w:r>
     </w:p>
     <w:p>
@@ -2306,21 +2312,24 @@
         <w:rPr>
           <w:b/>
         </w:rPr>
-        <w:t xml:space="preserve">Предусловия: </w:t>
+        <w:t>Предусловия:</w:t>
       </w:r>
       <w:r>
-        <w:t>Открыта исходная страница без параметров запроса. Все три поля верхней формы пустые.</w:t>
+        <w:t xml:space="preserve"> Открыта исходная страница без параметров запроса. Все три поля верхней формы пустые.</w:t>
       </w:r>
     </w:p>
     <w:p>
+      <w:pPr>
+        <w:spacing w:after="60"/>
+      </w:pPr>
       <w:r>
         <w:rPr>
           <w:b/>
         </w:rPr>
-        <w:t xml:space="preserve">Окружение: </w:t>
+        <w:t>Окружение:</w:t>
       </w:r>
       <w:r>
-        <w:t>1366 × 900 CSS px; остальные параметры — раздел 1.</w:t>
+        <w:t xml:space="preserve"> Windows 11 Pro, версия 10.0.22631, сборка 22631; настольный компьютер; Chromium 139.0.7258.5, headless; Playwright 1.51.1; размер видимой области браузера 1366 × 900 CSS px; масштаб 100%, коэффициент пикселей 1; язык en-US; часовой пояс Europe/Moscow.</w:t>
       </w:r>
     </w:p>
     <w:p>
@@ -2946,21 +2955,24 @@
         <w:rPr>
           <w:b/>
         </w:rPr>
-        <w:t xml:space="preserve">Предусловия: </w:t>
+        <w:t>Предусловия:</w:t>
       </w:r>
       <w:r>
-        <w:t>Открыта исходная страница калькулятора процентов.</w:t>
+        <w:t xml:space="preserve"> Открыта исходная страница калькулятора процентов.</w:t>
       </w:r>
     </w:p>
     <w:p>
+      <w:pPr>
+        <w:spacing w:after="60"/>
+      </w:pPr>
       <w:r>
         <w:rPr>
           <w:b/>
         </w:rPr>
-        <w:t xml:space="preserve">Окружение: </w:t>
+        <w:t>Окружение:</w:t>
       </w:r>
       <w:r>
-        <w:t>1366 × 900 CSS px; остальные параметры — раздел 1.</w:t>
+        <w:t xml:space="preserve"> Windows 11 Pro, версия 10.0.22631, сборка 22631; настольный компьютер; Chromium 139.0.7258.5, headless; Playwright 1.51.1; размер видимой области браузера 1366 × 900 CSS px; масштаб 100%, коэффициент пикселей 1; язык en-US; часовой пояс Europe/Moscow.</w:t>
       </w:r>
     </w:p>
     <w:p>
@@ -3578,21 +3590,24 @@
         <w:rPr>
           <w:b/>
         </w:rPr>
-        <w:t xml:space="preserve">Предусловия: </w:t>
+        <w:t>Предусловия:</w:t>
       </w:r>
       <w:r>
-        <w:t>Открыта исходная страница; нижняя форма Percentage Difference Calculator доступна на той же странице.</w:t>
+        <w:t xml:space="preserve"> Открыта исходная страница; нижняя форма Percentage Difference Calculator доступна на той же странице.</w:t>
       </w:r>
     </w:p>
     <w:p>
+      <w:pPr>
+        <w:spacing w:after="60"/>
+      </w:pPr>
       <w:r>
         <w:rPr>
           <w:b/>
         </w:rPr>
-        <w:t xml:space="preserve">Окружение: </w:t>
+        <w:t>Окружение:</w:t>
       </w:r>
       <w:r>
-        <w:t>1366 × 900 CSS px; остальные параметры — раздел 1.</w:t>
+        <w:t xml:space="preserve"> Windows 11 Pro, версия 10.0.22631, сборка 22631; настольный компьютер; Chromium 139.0.7258.5, headless; Playwright 1.51.1; размер видимой области браузера 1366 × 900 CSS px; масштаб 100%, коэффициент пикселей 1; язык en-US; часовой пояс Europe/Moscow.</w:t>
       </w:r>
     </w:p>
     <w:p>
@@ -4260,21 +4275,24 @@
         <w:rPr>
           <w:b/>
         </w:rPr>
-        <w:t xml:space="preserve">Предусловия: </w:t>
+        <w:t>Предусловия:</w:t>
       </w:r>
       <w:r>
-        <w:t>Область страницы 375 × 812 CSS px, масштаб 100%. Это проверка узкого окна настольного Chromium, а не физического телефона.</w:t>
+        <w:t xml:space="preserve"> Видимая область браузера 375 × 812 CSS px, масштаб 100%. Это проверка узкого окна настольного Chromium, а не физического телефона.</w:t>
       </w:r>
     </w:p>
     <w:p>
+      <w:pPr>
+        <w:spacing w:after="60"/>
+      </w:pPr>
       <w:r>
         <w:rPr>
           <w:b/>
         </w:rPr>
-        <w:t xml:space="preserve">Окружение: </w:t>
+        <w:t>Окружение:</w:t>
       </w:r>
       <w:r>
-        <w:t>375 × 812 CSS px; остальные параметры — раздел 1.</w:t>
+        <w:t xml:space="preserve"> Windows 11 Pro, версия 10.0.22631, сборка 22631; настольный компьютер; Chromium 139.0.7258.5, headless; Playwright 1.51.1; размер видимой области браузера 375 × 812 CSS px; масштаб 100%, коэффициент пикселей 1; язык en-US; часовой пояс Europe/Moscow.</w:t>
       </w:r>
     </w:p>
     <w:p>
@@ -4293,7 +4311,7 @@
         <w:spacing w:after="20"/>
       </w:pPr>
       <w:r>
-        <w:t>1. Установить ширину области страницы 375 px и высоту 812 px.</w:t>
+        <w:t>1. Установить ширину видимой области браузера 375 px и высоту 812 px.</w:t>
       </w:r>
     </w:p>
     <w:p>
@@ -4461,7 +4479,7 @@
         <w:rPr>
           <w:b/>
         </w:rPr>
-        <w:t>Date Calculator заменяет вставленное 202x на 2026 при выходе из поля Start Date без сообщения об ошибке</w:t>
+        <w:t>В Date Calculator поле года начальной даты Start Date восстанавливает 2026 после вставки 202x и нажатия Tab без сообщения об ошибке</w:t>
       </w:r>
     </w:p>
     <w:tbl>
@@ -4900,21 +4918,24 @@
         <w:rPr>
           <w:b/>
         </w:rPr>
-        <w:t xml:space="preserve">Предусловия: </w:t>
+        <w:t>Предусловия:</w:t>
       </w:r>
       <w:r>
-        <w:t>В Start Date исходный год равен 2026. Используется вставка всей строки, а не посимвольный набор: обработка клавиш может отличаться.</w:t>
+        <w:t xml:space="preserve"> В поле года начальной даты Start Date исходный год равен 2026. Используется вставка всей строки, а не посимвольный набор: обработка клавиш может отличаться.</w:t>
       </w:r>
     </w:p>
     <w:p>
+      <w:pPr>
+        <w:spacing w:after="60"/>
+      </w:pPr>
       <w:r>
         <w:rPr>
           <w:b/>
         </w:rPr>
-        <w:t xml:space="preserve">Окружение: </w:t>
+        <w:t>Окружение:</w:t>
       </w:r>
       <w:r>
-        <w:t>1366 × 900 CSS px; остальные параметры — раздел 1.</w:t>
+        <w:t xml:space="preserve"> Windows 11 Pro, версия 10.0.22631, сборка 22631; настольный компьютер; Chromium 139.0.7258.5, headless; Playwright 1.51.1; размер видимой области браузера 1366 × 900 CSS px; масштаб 100%, коэффициент пикселей 1; язык en-US; часовой пояс Europe/Moscow.</w:t>
       </w:r>
     </w:p>
     <w:p>
@@ -4933,7 +4954,7 @@
         <w:spacing w:after="20"/>
       </w:pPr>
       <w:r>
-        <w:t>1. Открыть Date Calculator и проверить исходный год 2026 в Start Date.</w:t>
+        <w:t>1. Открыть Date Calculator и проверить исходное значение 2026 в поле года начальной даты Start Date.</w:t>
       </w:r>
     </w:p>
     <w:p>
@@ -5590,21 +5611,24 @@
         <w:rPr>
           <w:b/>
         </w:rPr>
-        <w:t xml:space="preserve">Предусловия: </w:t>
+        <w:t>Предусловия:</w:t>
       </w:r>
       <w:r>
-        <w:t>Исходная страница открыта. Для технического подтверждения доступно дерево доступности браузера.</w:t>
+        <w:t xml:space="preserve"> Исходная страница открыта. Для технического подтверждения доступно дерево доступности браузера.</w:t>
       </w:r>
     </w:p>
     <w:p>
+      <w:pPr>
+        <w:spacing w:after="60"/>
+      </w:pPr>
       <w:r>
         <w:rPr>
           <w:b/>
         </w:rPr>
-        <w:t xml:space="preserve">Окружение: </w:t>
+        <w:t>Окружение:</w:t>
       </w:r>
       <w:r>
-        <w:t>1366 × 900 CSS px; остальные параметры — раздел 1.</w:t>
+        <w:t xml:space="preserve"> Windows 11 Pro, версия 10.0.22631, сборка 22631; настольный компьютер; Chromium 139.0.7258.5, headless; Playwright 1.51.1; размер видимой области браузера 1366 × 900 CSS px; масштаб 100%, коэффициент пикселей 1; язык en-US; часовой пояс Europe/Moscow.</w:t>
       </w:r>
     </w:p>
     <w:p>
@@ -6251,21 +6275,24 @@
         <w:rPr>
           <w:b/>
         </w:rPr>
-        <w:t xml:space="preserve">Предусловия: </w:t>
+        <w:t>Предусловия:</w:t>
       </w:r>
       <w:r>
-        <w:t>Открыта страница Time Calculator; используется именно нижний раздел Time Calculator in Expression.</w:t>
+        <w:t xml:space="preserve"> Открыта страница Time Calculator; используется именно нижний раздел Time Calculator in Expression.</w:t>
       </w:r>
     </w:p>
     <w:p>
+      <w:pPr>
+        <w:spacing w:after="60"/>
+      </w:pPr>
       <w:r>
         <w:rPr>
           <w:b/>
         </w:rPr>
-        <w:t xml:space="preserve">Окружение: </w:t>
+        <w:t>Окружение:</w:t>
       </w:r>
       <w:r>
-        <w:t>1366 × 900 CSS px; остальные параметры — раздел 1.</w:t>
+        <w:t xml:space="preserve"> Windows 11 Pro, версия 10.0.22631, сборка 22631; настольный компьютер; Chromium 139.0.7258.5, headless; Playwright 1.51.1; размер видимой области браузера 1366 × 900 CSS px; масштаб 100%, коэффициент пикселей 1; язык en-US; часовой пояс Europe/Moscow.</w:t>
       </w:r>
     </w:p>
     <w:p>
@@ -6883,21 +6910,24 @@
         <w:rPr>
           <w:b/>
         </w:rPr>
-        <w:t xml:space="preserve">Предусловия: </w:t>
+        <w:t>Предусловия:</w:t>
       </w:r>
       <w:r>
-        <w:t>Исходная страница Scientific Calculator, режим Deg. Отдельная программа экранного чтения не используется; проверяется дерево доступности браузера.</w:t>
+        <w:t xml:space="preserve"> Исходная страница Scientific Calculator, режим Deg. Отдельная программа экранного чтения не используется; проверяется дерево доступности браузера.</w:t>
       </w:r>
     </w:p>
     <w:p>
+      <w:pPr>
+        <w:spacing w:after="60"/>
+      </w:pPr>
       <w:r>
         <w:rPr>
           <w:b/>
         </w:rPr>
-        <w:t xml:space="preserve">Окружение: </w:t>
+        <w:t>Окружение:</w:t>
       </w:r>
       <w:r>
-        <w:t>1366 × 900 CSS px; остальные параметры — раздел 1.</w:t>
+        <w:t xml:space="preserve"> Windows 11 Pro, версия 10.0.22631, сборка 22631; настольный компьютер; Chromium 139.0.7258.5, headless; Playwright 1.51.1; размер видимой области браузера 1366 × 900 CSS px; масштаб 100%, коэффициент пикселей 1; язык en-US; часовой пояс Europe/Moscow.</w:t>
       </w:r>
     </w:p>
     <w:p>

</xml_diff>